<commit_message>
Add repository URL to report
</commit_message>
<xml_diff>
--- a/Template_export/Homework1_Report.docx
+++ b/Template_export/Homework1_Report.docx
@@ -142,6 +142,19 @@
       <w:pPr/>
       <w:r>
         <w:t xml:space="preserve">In these measurements, GPU end-to-end time was already beneficial at matrix size 256. The crossover is not at size zero because CUDA has fixed overhead from launching a kernel and copying data between host and device. For very small matrices, that overhead can dominate the arithmetic work. As matrix size increases, the amount of parallel computation grows much faster than transfer overhead, so GPU speedup becomes much larger.</w:t>
+      </w:r>
+    </w:p>
+    <w:p>
+      <w:pPr>
+        <w:pStyle w:val="Heading1"/>
+      </w:pPr>
+      <w:r>
+        <w:t xml:space="preserve">Repository URL</w:t>
+      </w:r>
+    </w:p>
+    <w:p>
+      <w:r>
+        <w:t xml:space="preserve">https://github.com/AkhileshTandur/data266-6812</w:t>
       </w:r>
     </w:p>
     <w:sectPr>

</xml_diff>